<commit_message>
feat(proof): PEE-01 mechanical checks v2 and cancel late-result guard
Expand the typo allowlist to 40 frozen tokens, delete only the second duplicate function word including tab/NBSP, and comment on a wider placeholder set after unique-family promotion gates. Cancelled jobs cannot publish a late download. Remote/R2 processing stays disabled. Mixed-format recieve stays labelled. Lab Word COM PASS on body/table/prior_review/party_name.
</commit_message>
<xml_diff>
--- a/docs/proof/word-review/body_Proofread.docx
+++ b/docs/proof/word-review/body_Proofread.docx
@@ -17,11 +17,11 @@
         </w:r>
       </w:ins>
       <w:r>
-        <w:t xml:space="preserve"> the</w:t>
+        <w:t xml:space="preserve"> the </w:t>
       </w:r>
       <w:del w:id="4" w:author="Agmt Proof" w:date="2026-09-05T00:00:00.000Z">
         <w:r>
-          <w:delText xml:space="preserve"> the</w:delText>
+          <w:delText xml:space="preserve">the</w:delText>
         </w:r>
       </w:del>
       <w:r>

</xml_diff>